<commit_message>
Update: UI enhancements and fix landing page features
</commit_message>
<xml_diff>
--- a/Proposal/Standard_Business_Plan_For_Matgarco.docx
+++ b/Proposal/Standard_Business_Plan_For_Matgarco.docx
@@ -174,7 +174,6 @@
     <w:p>
       <w:pPr>
         <w:rPr>
-          <w:rFonts w:hint="cs"/>
           <w:rtl/>
           <w:lang w:bidi="ar-EG"/>
         </w:rPr>
@@ -987,6 +986,78 @@
     </w:p>
     <w:p>
       <w:pPr>
+        <w:numPr>
+          <w:ilvl w:val="0"/>
+          <w:numId w:val="16"/>
+        </w:numPr>
+        <w:rPr>
+          <w:b/>
+          <w:bCs/>
+          <w:lang w:bidi="ar-EG"/>
+        </w:rPr>
+      </w:pPr>
+      <w:r>
+        <w:rPr>
+          <w:b/>
+          <w:bCs/>
+          <w:lang w:bidi="ar-EG"/>
+        </w:rPr>
+        <w:t>Contact address</w:t>
+      </w:r>
+      <w:r>
+        <w:rPr>
+          <w:rFonts w:hint="cs"/>
+          <w:b/>
+          <w:bCs/>
+          <w:rtl/>
+          <w:lang w:bidi="ar-EG"/>
+        </w:rPr>
+        <w:t>:</w:t>
+      </w:r>
+      <w:r>
+        <w:rPr>
+          <w:b/>
+          <w:bCs/>
+          <w:lang w:bidi="ar-EG"/>
+        </w:rPr>
+        <w:t xml:space="preserve"> </w:t>
+      </w:r>
+      <w:r>
+        <w:rPr>
+          <w:rFonts w:cs="Arial"/>
+          <w:b/>
+          <w:bCs/>
+          <w:lang w:bidi="ar-EG"/>
+        </w:rPr>
+        <w:t>12</w:t>
+      </w:r>
+      <w:r>
+        <w:rPr>
+          <w:b/>
+          <w:bCs/>
+          <w:lang w:bidi="ar-EG"/>
+        </w:rPr>
+        <w:t xml:space="preserve"> Badr</w:t>
+      </w:r>
+      <w:r>
+        <w:rPr>
+          <w:b/>
+          <w:bCs/>
+          <w:lang w:bidi="ar-EG"/>
+        </w:rPr>
+        <w:t xml:space="preserve"> Buildings</w:t>
+      </w:r>
+      <w:r>
+        <w:rPr>
+          <w:b/>
+          <w:bCs/>
+          <w:lang w:bidi="ar-EG"/>
+        </w:rPr>
+        <w:t xml:space="preserve"> - Maadi - Cairo - Egypt buildings</w:t>
+      </w:r>
+    </w:p>
+    <w:p>
+      <w:pPr>
         <w:rPr>
           <w:lang w:bidi="ar-EG"/>
         </w:rPr>
@@ -1031,49 +1102,7 @@
         <w:rPr>
           <w:lang w:bidi="ar-EG"/>
         </w:rPr>
-        <w:t xml:space="preserve"> Matgarco is a specialized SaaS platform engineered to migrate Egyptian small businesses from informal social media selling to structured, professional e-commerce. By offering a "Zero-Code" environment, the platform allows merchants to generate fully functional online stores in under 10 minutes. Matgarco differentiates itself through a hyper-local approach, providing EGP-based pricing, native Arabic AI content generation, and seamless integration with Egypt’s primary payment (</w:t>
-      </w:r>
-      <w:proofErr w:type="spellStart"/>
-      <w:r>
-        <w:rPr>
-          <w:lang w:bidi="ar-EG"/>
-        </w:rPr>
-        <w:t>Fawry</w:t>
-      </w:r>
-      <w:proofErr w:type="spellEnd"/>
-      <w:r>
-        <w:rPr>
-          <w:lang w:bidi="ar-EG"/>
-        </w:rPr>
-        <w:t>/</w:t>
-      </w:r>
-      <w:proofErr w:type="spellStart"/>
-      <w:r>
-        <w:rPr>
-          <w:lang w:bidi="ar-EG"/>
-        </w:rPr>
-        <w:t>Paymob</w:t>
-      </w:r>
-      <w:proofErr w:type="spellEnd"/>
-      <w:r>
-        <w:rPr>
-          <w:lang w:bidi="ar-EG"/>
-        </w:rPr>
-        <w:t>) and logistics (</w:t>
-      </w:r>
-      <w:proofErr w:type="spellStart"/>
-      <w:r>
-        <w:rPr>
-          <w:lang w:bidi="ar-EG"/>
-        </w:rPr>
-        <w:t>Bosta</w:t>
-      </w:r>
-      <w:proofErr w:type="spellEnd"/>
-      <w:r>
-        <w:rPr>
-          <w:lang w:bidi="ar-EG"/>
-        </w:rPr>
-        <w:t>) networks.</w:t>
+        <w:t xml:space="preserve"> Matgarco is a specialized SaaS platform engineered to migrate Egyptian small businesses from informal social media selling to structured, professional e-commerce. By offering a "Zero-Code" environment, the platform allows merchants to generate fully functional online stores in under 10 minutes. Matgarco differentiates itself through a hyper-local approach, providing EGP-based pricing, native Arabic AI content generation, and seamless integration with Egypt’s primary payment (Fawry/Paymob) and logistics (Bosta) networks.</w:t>
       </w:r>
     </w:p>
     <w:p>
@@ -1228,7 +1257,6 @@
           <w:bCs/>
           <w:lang w:bidi="ar-EG"/>
         </w:rPr>
-        <w:lastRenderedPageBreak/>
         <w:t>Customers:</w:t>
       </w:r>
       <w:r>
@@ -1702,8 +1730,9 @@
         <w:rPr>
           <w:lang w:bidi="ar-EG"/>
         </w:rPr>
+        <w:lastRenderedPageBreak/>
         <w:pict w14:anchorId="1D9FD605">
-          <v:rect id="_x0000_i1097" style="width:0;height:1.5pt" o:hralign="center" o:hrstd="t" o:hrnoshade="t" o:hr="t" fillcolor="gray" stroked="f"/>
+          <v:rect id="_x0000_i1025" style="width:0;height:1.5pt" o:hralign="center" o:hrstd="t" o:hrnoshade="t" o:hr="t" fillcolor="gray" stroked="f"/>
         </w:pict>
       </w:r>
     </w:p>
@@ -1726,7 +1755,6 @@
           <w:szCs w:val="36"/>
           <w:lang w:bidi="ar-EG"/>
         </w:rPr>
-        <w:lastRenderedPageBreak/>
         <w:t>2. Business Idea and Market</w:t>
       </w:r>
     </w:p>
@@ -2070,6 +2098,7 @@
           <w:bCs/>
           <w:lang w:bidi="ar-EG"/>
         </w:rPr>
+        <w:lastRenderedPageBreak/>
         <w:t>Seamless Local Integration:</w:t>
       </w:r>
       <w:r>
@@ -2078,7 +2107,6 @@
         </w:rPr>
         <w:t xml:space="preserve"> Native connectivity with </w:t>
       </w:r>
-      <w:proofErr w:type="spellStart"/>
       <w:r>
         <w:rPr>
           <w:b/>
@@ -2087,41 +2115,20 @@
         </w:rPr>
         <w:t>Bosta</w:t>
       </w:r>
-      <w:proofErr w:type="spellEnd"/>
       <w:r>
         <w:rPr>
           <w:lang w:bidi="ar-EG"/>
         </w:rPr>
         <w:t xml:space="preserve"> for logistics and </w:t>
       </w:r>
-      <w:proofErr w:type="spellStart"/>
-      <w:r>
-        <w:rPr>
-          <w:b/>
-          <w:bCs/>
-          <w:lang w:bidi="ar-EG"/>
-        </w:rPr>
-        <w:t>Paymob</w:t>
-      </w:r>
-      <w:proofErr w:type="spellEnd"/>
-      <w:r>
-        <w:rPr>
-          <w:b/>
-          <w:bCs/>
-          <w:lang w:bidi="ar-EG"/>
-        </w:rPr>
-        <w:t>/</w:t>
-      </w:r>
-      <w:proofErr w:type="spellStart"/>
-      <w:r>
-        <w:rPr>
-          <w:b/>
-          <w:bCs/>
-          <w:lang w:bidi="ar-EG"/>
-        </w:rPr>
-        <w:t>Fawry</w:t>
-      </w:r>
-      <w:proofErr w:type="spellEnd"/>
+      <w:r>
+        <w:rPr>
+          <w:b/>
+          <w:bCs/>
+          <w:lang w:bidi="ar-EG"/>
+        </w:rPr>
+        <w:t>Paymob/Fawry</w:t>
+      </w:r>
       <w:r>
         <w:rPr>
           <w:lang w:bidi="ar-EG"/>
@@ -2141,7 +2148,6 @@
           <w:bCs/>
           <w:lang w:bidi="ar-EG"/>
         </w:rPr>
-        <w:lastRenderedPageBreak/>
         <w:t>Customer Acquisition Strategy:</w:t>
       </w:r>
     </w:p>
@@ -2470,25 +2476,7 @@
           <w:bCs/>
           <w:lang w:bidi="ar-EG"/>
         </w:rPr>
-        <w:t>Regional Competitors (Salla/</w:t>
-      </w:r>
-      <w:proofErr w:type="spellStart"/>
-      <w:r>
-        <w:rPr>
-          <w:b/>
-          <w:bCs/>
-          <w:lang w:bidi="ar-EG"/>
-        </w:rPr>
-        <w:t>Zid</w:t>
-      </w:r>
-      <w:proofErr w:type="spellEnd"/>
-      <w:r>
-        <w:rPr>
-          <w:b/>
-          <w:bCs/>
-          <w:lang w:bidi="ar-EG"/>
-        </w:rPr>
-        <w:t>):</w:t>
+        <w:t>Regional Competitors (Salla/Zid):</w:t>
       </w:r>
       <w:r>
         <w:rPr>
@@ -2513,25 +2501,8 @@
           <w:bCs/>
           <w:lang w:bidi="ar-EG"/>
         </w:rPr>
-        <w:t>Local Competitors (</w:t>
-      </w:r>
-      <w:proofErr w:type="spellStart"/>
-      <w:r>
-        <w:rPr>
-          <w:b/>
-          <w:bCs/>
-          <w:lang w:bidi="ar-EG"/>
-        </w:rPr>
-        <w:t>ExpandCart</w:t>
-      </w:r>
-      <w:proofErr w:type="spellEnd"/>
-      <w:r>
-        <w:rPr>
-          <w:b/>
-          <w:bCs/>
-          <w:lang w:bidi="ar-EG"/>
-        </w:rPr>
-        <w:t>):</w:t>
+        <w:lastRenderedPageBreak/>
+        <w:t>Local Competitors (ExpandCart):</w:t>
       </w:r>
       <w:r>
         <w:rPr>
@@ -2552,7 +2523,6 @@
           <w:bCs/>
           <w:lang w:bidi="ar-EG"/>
         </w:rPr>
-        <w:lastRenderedPageBreak/>
         <w:t>Market Share Objective:</w:t>
       </w:r>
     </w:p>
@@ -2594,7 +2564,7 @@
           <w:lang w:bidi="ar-EG"/>
         </w:rPr>
         <w:pict w14:anchorId="0035DBCD">
-          <v:rect id="_x0000_i1114" style="width:0;height:1.5pt" o:hralign="center" o:hrstd="t" o:hrnoshade="t" o:hr="t" fillcolor="gray" stroked="f"/>
+          <v:rect id="_x0000_i1026" style="width:0;height:1.5pt" o:hralign="center" o:hrstd="t" o:hrnoshade="t" o:hr="t" fillcolor="gray" stroked="f"/>
         </w:pict>
       </w:r>
     </w:p>
@@ -2628,9 +2598,9 @@
       <w:lvlJc w:val="left"/>
       <w:pPr>
         <w:tabs>
-          <w:tab w:val="num" w:pos="720"/>
-        </w:tabs>
-        <w:ind w:left="720" w:hanging="360"/>
+          <w:tab w:val="num" w:pos="5850"/>
+        </w:tabs>
+        <w:ind w:left="5850" w:hanging="360"/>
       </w:pPr>
       <w:rPr>
         <w:rFonts w:ascii="Symbol" w:hAnsi="Symbol" w:hint="default"/>
@@ -2644,9 +2614,9 @@
       <w:lvlJc w:val="left"/>
       <w:pPr>
         <w:tabs>
-          <w:tab w:val="num" w:pos="1440"/>
-        </w:tabs>
-        <w:ind w:left="1440" w:hanging="360"/>
+          <w:tab w:val="num" w:pos="6570"/>
+        </w:tabs>
+        <w:ind w:left="6570" w:hanging="360"/>
       </w:pPr>
       <w:rPr>
         <w:rFonts w:ascii="Courier New" w:hAnsi="Courier New" w:hint="default"/>
@@ -2660,9 +2630,9 @@
       <w:lvlJc w:val="left"/>
       <w:pPr>
         <w:tabs>
-          <w:tab w:val="num" w:pos="2160"/>
-        </w:tabs>
-        <w:ind w:left="2160" w:hanging="360"/>
+          <w:tab w:val="num" w:pos="7290"/>
+        </w:tabs>
+        <w:ind w:left="7290" w:hanging="360"/>
       </w:pPr>
       <w:rPr>
         <w:rFonts w:ascii="Wingdings" w:hAnsi="Wingdings" w:hint="default"/>
@@ -2676,9 +2646,9 @@
       <w:lvlJc w:val="left"/>
       <w:pPr>
         <w:tabs>
-          <w:tab w:val="num" w:pos="2880"/>
-        </w:tabs>
-        <w:ind w:left="2880" w:hanging="360"/>
+          <w:tab w:val="num" w:pos="8010"/>
+        </w:tabs>
+        <w:ind w:left="8010" w:hanging="360"/>
       </w:pPr>
       <w:rPr>
         <w:rFonts w:ascii="Wingdings" w:hAnsi="Wingdings" w:hint="default"/>
@@ -2692,9 +2662,9 @@
       <w:lvlJc w:val="left"/>
       <w:pPr>
         <w:tabs>
-          <w:tab w:val="num" w:pos="3600"/>
-        </w:tabs>
-        <w:ind w:left="3600" w:hanging="360"/>
+          <w:tab w:val="num" w:pos="8730"/>
+        </w:tabs>
+        <w:ind w:left="8730" w:hanging="360"/>
       </w:pPr>
       <w:rPr>
         <w:rFonts w:ascii="Wingdings" w:hAnsi="Wingdings" w:hint="default"/>
@@ -2708,9 +2678,9 @@
       <w:lvlJc w:val="left"/>
       <w:pPr>
         <w:tabs>
-          <w:tab w:val="num" w:pos="4320"/>
-        </w:tabs>
-        <w:ind w:left="4320" w:hanging="360"/>
+          <w:tab w:val="num" w:pos="9450"/>
+        </w:tabs>
+        <w:ind w:left="9450" w:hanging="360"/>
       </w:pPr>
       <w:rPr>
         <w:rFonts w:ascii="Wingdings" w:hAnsi="Wingdings" w:hint="default"/>
@@ -2724,9 +2694,9 @@
       <w:lvlJc w:val="left"/>
       <w:pPr>
         <w:tabs>
-          <w:tab w:val="num" w:pos="5040"/>
-        </w:tabs>
-        <w:ind w:left="5040" w:hanging="360"/>
+          <w:tab w:val="num" w:pos="10170"/>
+        </w:tabs>
+        <w:ind w:left="10170" w:hanging="360"/>
       </w:pPr>
       <w:rPr>
         <w:rFonts w:ascii="Wingdings" w:hAnsi="Wingdings" w:hint="default"/>
@@ -2740,9 +2710,9 @@
       <w:lvlJc w:val="left"/>
       <w:pPr>
         <w:tabs>
-          <w:tab w:val="num" w:pos="5760"/>
-        </w:tabs>
-        <w:ind w:left="5760" w:hanging="360"/>
+          <w:tab w:val="num" w:pos="10890"/>
+        </w:tabs>
+        <w:ind w:left="10890" w:hanging="360"/>
       </w:pPr>
       <w:rPr>
         <w:rFonts w:ascii="Wingdings" w:hAnsi="Wingdings" w:hint="default"/>
@@ -2756,9 +2726,9 @@
       <w:lvlJc w:val="left"/>
       <w:pPr>
         <w:tabs>
-          <w:tab w:val="num" w:pos="6480"/>
-        </w:tabs>
-        <w:ind w:left="6480" w:hanging="360"/>
+          <w:tab w:val="num" w:pos="11610"/>
+        </w:tabs>
+        <w:ind w:left="11610" w:hanging="360"/>
       </w:pPr>
       <w:rPr>
         <w:rFonts w:ascii="Wingdings" w:hAnsi="Wingdings" w:hint="default"/>

</xml_diff>